<commit_message>
feat(data_validation): add CV and time-of-day rankings to edge stdev analysis
- Add `rank_edges_by_cv`/`print_cv_ranking` to rank edges by coefficient of
  variation (stdev/mean), bucketed into stable/acceptable/investigate, with
  median travel time alongside the mean for a more robust read
- Add `rank_edges_by_hourly_range`/`print_hourly_range_ranking` to flag edges
  whose hourly mean total swings widely (time-of-day pattern vs static weight)
- Switch the hour-of-day breakdown (`print_hourly_breakdown`) to run on the
  hourly-range ranking instead of the plain stdev ranking, so it surfaces
  edges with real time-of-day variation rather than just noisy ones
- Add `print_executive_summary` to collapse the CV/hourly-range sections into
  a stability + time-of-day summary and the union of edges needing attention
- Guard `print_hourly_breakdown` against empty per-hour sample buckets
</commit_message>
<xml_diff>
--- a/.meetings/26.06.25.docx
+++ b/.meetings/26.06.25.docx
@@ -164,13 +164,7 @@
         <w:rPr>
           <w:rFonts w:ascii="Arial" w:hAnsi="Arial" w:cs="Arial"/>
         </w:rPr>
-        <w:t>build_shared_platform_lines</w:t>
-      </w:r>
-      <w:r>
-        <w:rPr>
-          <w:rFonts w:ascii="Arial" w:hAnsi="Arial" w:cs="Arial"/>
-        </w:rPr>
-        <w:t>)</w:t>
+        <w:t>build_shared_platform_lines)</w:t>
       </w:r>
     </w:p>
     <w:p>
@@ -260,13 +254,7 @@
         <w:rPr>
           <w:rFonts w:ascii="Arial" w:hAnsi="Arial" w:cs="Arial"/>
         </w:rPr>
-        <w:t xml:space="preserve">A </w:t>
-      </w:r>
-      <w:r>
-        <w:rPr>
-          <w:rFonts w:ascii="Arial" w:hAnsi="Arial" w:cs="Arial"/>
-        </w:rPr>
-        <w:t>analysis/shared_platforms.py </w:t>
+        <w:t>A analysis/shared_platforms.py </w:t>
       </w:r>
       <w:r>
         <w:rPr>
@@ -302,19 +290,7 @@
         <w:rPr>
           <w:rFonts w:ascii="Arial" w:hAnsi="Arial" w:cs="Arial"/>
         </w:rPr>
-        <w:t xml:space="preserve">A </w:t>
-      </w:r>
-      <w:r>
-        <w:rPr>
-          <w:rFonts w:ascii="Arial" w:hAnsi="Arial" w:cs="Arial"/>
-        </w:rPr>
-        <w:t>analysis/directional_asymmetry.py</w:t>
-      </w:r>
-      <w:r>
-        <w:rPr>
-          <w:rFonts w:ascii="Arial" w:hAnsi="Arial" w:cs="Arial"/>
-        </w:rPr>
-        <w:t xml:space="preserve"> </w:t>
+        <w:t xml:space="preserve">A analysis/directional_asymmetry.py </w:t>
       </w:r>
       <w:r>
         <w:rPr>
@@ -351,6 +327,84 @@
           <w:rFonts w:ascii="Arial" w:hAnsi="Arial" w:cs="Arial"/>
         </w:rPr>
         <w:t>data_validation/processing/5_shared_platforms_duplication.py</w:t>
+      </w:r>
+      <w:r>
+        <w:rPr>
+          <w:rFonts w:ascii="Arial" w:hAnsi="Arial" w:cs="Arial"/>
+        </w:rPr>
+        <w:t xml:space="preserve"> new</w:t>
+      </w:r>
+    </w:p>
+    <w:p>
+      <w:pPr>
+        <w:pStyle w:val="ListParagraph"/>
+        <w:numPr>
+          <w:ilvl w:val="0"/>
+          <w:numId w:val="1"/>
+        </w:numPr>
+        <w:rPr>
+          <w:rFonts w:ascii="Arial" w:hAnsi="Arial" w:cs="Arial"/>
+        </w:rPr>
+      </w:pPr>
+      <w:r>
+        <w:rPr>
+          <w:rFonts w:ascii="Arial" w:hAnsi="Arial" w:cs="Arial"/>
+        </w:rPr>
+        <w:t>scripts/stops_report.py</w:t>
+      </w:r>
+    </w:p>
+    <w:p>
+      <w:pPr>
+        <w:pStyle w:val="ListParagraph"/>
+        <w:numPr>
+          <w:ilvl w:val="1"/>
+          <w:numId w:val="1"/>
+        </w:numPr>
+        <w:rPr>
+          <w:rFonts w:ascii="Arial" w:hAnsi="Arial" w:cs="Arial"/>
+        </w:rPr>
+      </w:pPr>
+      <w:r>
+        <w:rPr>
+          <w:rFonts w:ascii="Arial" w:hAnsi="Arial" w:cs="Arial"/>
+        </w:rPr>
+        <w:t>deixa escollir entre les dades originals o artificials</w:t>
+      </w:r>
+    </w:p>
+    <w:p>
+      <w:pPr>
+        <w:pStyle w:val="ListParagraph"/>
+        <w:numPr>
+          <w:ilvl w:val="1"/>
+          <w:numId w:val="1"/>
+        </w:numPr>
+        <w:rPr>
+          <w:rFonts w:ascii="Arial" w:hAnsi="Arial" w:cs="Arial"/>
+        </w:rPr>
+      </w:pPr>
+      <w:r>
+        <w:rPr>
+          <w:rFonts w:ascii="Arial" w:hAnsi="Arial" w:cs="Arial"/>
+        </w:rPr>
+        <w:t>mostra si el sentit només és un</w:t>
+      </w:r>
+    </w:p>
+    <w:p>
+      <w:pPr>
+        <w:pStyle w:val="ListParagraph"/>
+        <w:numPr>
+          <w:ilvl w:val="0"/>
+          <w:numId w:val="1"/>
+        </w:numPr>
+        <w:rPr>
+          <w:rFonts w:ascii="Arial" w:hAnsi="Arial" w:cs="Arial"/>
+        </w:rPr>
+      </w:pPr>
+      <w:r>
+        <w:rPr>
+          <w:rFonts w:ascii="Arial" w:hAnsi="Arial" w:cs="Arial"/>
+        </w:rPr>
+        <w:t>data_validation/analysis/edge_stdev.py</w:t>
       </w:r>
       <w:r>
         <w:rPr>
@@ -1092,6 +1146,7 @@
   <w:style w:type="character" w:default="1" w:styleId="DefaultParagraphFont">
     <w:name w:val="Default Paragraph Font"/>
     <w:uiPriority w:val="1"/>
+    <w:semiHidden/>
     <w:unhideWhenUsed/>
   </w:style>
   <w:style w:type="table" w:default="1" w:styleId="TableNormal">

</xml_diff>

<commit_message>
refactor(data_validation): dedupe edge_weight_validation helpers and trim stale comments
- Extract shared helpers (_stop_labels, _door_sw_records, _dominant_stdev, _print_edge_summary, _print_hour_table) to remove duplication across the ranking/printing functions
- Drop rank_edges_by_stdev and print_ranked_edges, which were superseded by the CV/hourly-range rankings
- Trim verbose inline comments that restated what the code already shows
- Regenerate edge_weight_validation_report.txt and update README.md to match the refactored output
</commit_message>
<xml_diff>
--- a/.meetings/26.06.25.docx
+++ b/.meetings/26.06.25.docx
@@ -80,6 +80,25 @@
           <w:t>link</w:t>
         </w:r>
       </w:hyperlink>
+      <w:r>
+        <w:t xml:space="preserve"> </w:t>
+      </w:r>
+      <w:r>
+        <w:sym w:font="Wingdings" w:char="F0DF"/>
+      </w:r>
+      <w:r>
+        <w:t xml:space="preserve"> </w:t>
+      </w:r>
+      <w:r>
+        <w:rPr>
+          <w:rFonts w:ascii="Arial" w:hAnsi="Arial" w:cs="Arial"/>
+          <w:highlight w:val="yellow"/>
+        </w:rPr>
+        <w:t>SÍ, ENS HO CREIEM</w:t>
+      </w:r>
+      <w:r>
+        <w:t xml:space="preserve"> </w:t>
+      </w:r>
     </w:p>
     <w:p>
       <w:pPr>

</xml_diff>